<commit_message>
updating RAG & Project V1 RMD & messing with RShiny
</commit_message>
<xml_diff>
--- a/RAG/Final Project RAG Document.docx
+++ b/RAG/Final Project RAG Document.docx
@@ -96,19 +96,7 @@
         </w:numPr>
       </w:pPr>
       <w:r>
-        <w:t xml:space="preserve">Passenger Count is driver-reported so when driver </w:t>
-      </w:r>
-      <w:r>
-        <w:t>doesn’t</w:t>
-      </w:r>
-      <w:r>
-        <w:t xml:space="preserve"> report count, it will</w:t>
-      </w:r>
-      <w:r>
-        <w:t xml:space="preserve"> </w:t>
-      </w:r>
-      <w:r>
-        <w:t xml:space="preserve">be a NA. It is commonly understood that when </w:t>
+        <w:t xml:space="preserve">Passenger Count is driver-reported so when driver doesn’t report count, it will be a NA. It is commonly understood that when </w:t>
       </w:r>
       <w:proofErr w:type="spellStart"/>
       <w:r>
@@ -116,13 +104,7 @@
       </w:r>
       <w:proofErr w:type="spellEnd"/>
       <w:r>
-        <w:t xml:space="preserve"> is over 1, passengers are less </w:t>
-      </w:r>
-      <w:r>
-        <w:t>likely</w:t>
-      </w:r>
-      <w:r>
-        <w:t xml:space="preserve"> to take responsibility to tip. Given these factors, we filtered our dataset to just look at observations where the passenger count was equal to 1. </w:t>
+        <w:t xml:space="preserve"> is over 1, passengers are less likely to take responsibility to tip. Given these factors, we filtered our dataset to just look at observations where the passenger count was equal to 1. </w:t>
       </w:r>
     </w:p>
     <w:p>
@@ -134,13 +116,83 @@
         </w:numPr>
       </w:pPr>
       <w:r>
-        <w:t xml:space="preserve">Because airport trips often involve unique fare structures, longer travel distances, and different rider tipping behavior than typical city taxi rides, it is reasonable to exclude them and focus the analysis on non-airport </w:t>
-      </w:r>
-      <w:r>
-        <w:t>trips,</w:t>
-      </w:r>
-      <w:r>
-        <w:t xml:space="preserve"> so the model reflects a more consistent and representative set of everyday taxi rides.</w:t>
+        <w:t>Because airport trips often involve unique fare structures, longer travel distances, and different rider tipping behavior than typical city taxi rides, it is reasonable to exclude them and focus the analysis on non-airport trips, so the model reflects a more consistent and representative set of everyday taxi rides.</w:t>
+      </w:r>
+    </w:p>
+    <w:p>
+      <w:pPr>
+        <w:pStyle w:val="ListParagraph"/>
+        <w:numPr>
+          <w:ilvl w:val="1"/>
+          <w:numId w:val="2"/>
+        </w:numPr>
+      </w:pPr>
+      <w:r>
+        <w:t xml:space="preserve">We also wanted to </w:t>
+      </w:r>
+      <w:proofErr w:type="gramStart"/>
+      <w:r>
+        <w:t>look into</w:t>
+      </w:r>
+      <w:proofErr w:type="gramEnd"/>
+      <w:r>
+        <w:t xml:space="preserve"> what </w:t>
+      </w:r>
+      <w:proofErr w:type="spellStart"/>
+      <w:r>
+        <w:t>total_amount</w:t>
+      </w:r>
+      <w:proofErr w:type="spellEnd"/>
+      <w:r>
+        <w:t xml:space="preserve"> was composed of. We found that total amount is equal to </w:t>
+      </w:r>
+      <w:proofErr w:type="spellStart"/>
+      <w:r>
+        <w:t>fare_amount</w:t>
+      </w:r>
+      <w:proofErr w:type="spellEnd"/>
+      <w:r>
+        <w:t xml:space="preserve"> + </w:t>
+      </w:r>
+      <w:proofErr w:type="gramStart"/>
+      <w:r>
+        <w:t>all of</w:t>
+      </w:r>
+      <w:proofErr w:type="gramEnd"/>
+      <w:r>
+        <w:t xml:space="preserve"> the extra taxes / amounts + </w:t>
+      </w:r>
+      <w:proofErr w:type="spellStart"/>
+      <w:r>
+        <w:t>tip_amount</w:t>
+      </w:r>
+      <w:proofErr w:type="spellEnd"/>
+      <w:r>
+        <w:t>. It does NOT include however "</w:t>
+      </w:r>
+      <w:proofErr w:type="spellStart"/>
+      <w:r>
+        <w:t>congestion_surchage</w:t>
+      </w:r>
+      <w:proofErr w:type="spellEnd"/>
+      <w:r>
+        <w:t xml:space="preserve">". Thus, we will not use </w:t>
+      </w:r>
+      <w:proofErr w:type="spellStart"/>
+      <w:r>
+        <w:t>total_amount</w:t>
+      </w:r>
+      <w:proofErr w:type="spellEnd"/>
+      <w:r>
+        <w:t xml:space="preserve"> to predict for </w:t>
+      </w:r>
+      <w:proofErr w:type="spellStart"/>
+      <w:r>
+        <w:t>tip_amount</w:t>
+      </w:r>
+      <w:proofErr w:type="spellEnd"/>
+      <w:r>
+        <w:t xml:space="preserve"> due to issues such as data leakage.</w:t>
       </w:r>
     </w:p>
     <w:p>
@@ -179,16 +231,7 @@
         </w:numPr>
       </w:pPr>
       <w:r>
-        <w:t>We wanted</w:t>
-      </w:r>
-      <w:r>
-        <w:t xml:space="preserve"> to take detail look at tip</w:t>
-      </w:r>
-      <w:r>
-        <w:t xml:space="preserve"> </w:t>
-      </w:r>
-      <w:r>
-        <w:t>percentage (tip %)</w:t>
+        <w:t>We wanted to take detail look at tip percentage (tip %)</w:t>
       </w:r>
     </w:p>
     <w:p>
@@ -212,13 +255,7 @@
         </w:numPr>
       </w:pPr>
       <w:r>
-        <w:t xml:space="preserve">Distribution of tip percentage (tip %) appears relatively consistent </w:t>
-      </w:r>
-      <w:r>
-        <w:t>throughout</w:t>
-      </w:r>
-      <w:r>
-        <w:t xml:space="preserve"> each day of the week</w:t>
+        <w:t>Distribution of tip percentage (tip %) appears relatively consistent throughout each day of the week</w:t>
       </w:r>
     </w:p>
     <w:p>
@@ -230,10 +267,11 @@
         </w:numPr>
       </w:pPr>
       <w:r>
-        <w:t>There appears</w:t>
-      </w:r>
-      <w:r>
-        <w:t xml:space="preserve"> to be a negative, nonlinear association between fare amount and tip percentage. For smaller fares, tip percentages are much more spread out and can be quite large, while for larger fares, tip percentages tend to be lower and more tightly clustered. This pattern suggests that riders often leave disproportionately high percentage tips on very small fares, whereas tip percentages become more consistent at more moderate levels as </w:t>
+        <w:t xml:space="preserve">There appears to be a negative, nonlinear association between fare amount and tip percentage. For smaller fares, tip percentages are much more spread out and can be quite large, while for larger fares, tip percentages tend to be lower and more tightly clustered. This pattern suggests that riders often leave </w:t>
+      </w:r>
+      <w:r>
+        <w:lastRenderedPageBreak/>
+        <w:t xml:space="preserve">disproportionately high percentage tips on very small fares, whereas tip percentages become more consistent at more moderate levels as </w:t>
       </w:r>
       <w:proofErr w:type="spellStart"/>
       <w:r>
@@ -241,10 +279,7 @@
       </w:r>
       <w:proofErr w:type="spellEnd"/>
       <w:r>
-        <w:t xml:space="preserve"> </w:t>
-      </w:r>
-      <w:r>
-        <w:t>amount increases.</w:t>
+        <w:t xml:space="preserve"> amount increases.</w:t>
       </w:r>
     </w:p>
     <w:p>
@@ -256,7 +291,6 @@
         </w:numPr>
       </w:pPr>
       <w:r>
-        <w:lastRenderedPageBreak/>
         <w:t>Distribution of tip amount appears to be right-skewed. This indicates that small to moderate tips are common, while relatively large tips occur much less frequently.</w:t>
       </w:r>
     </w:p>
@@ -441,11 +475,8 @@
         </w:numPr>
       </w:pPr>
       <w:r>
-        <w:t xml:space="preserve">We initially ran a multiple linear regression model with multiple predictors but after looking at the residual plots, we thought it would be best to perform a log-linear transformation as well as add a </w:t>
-      </w:r>
-      <w:r>
         <w:lastRenderedPageBreak/>
-        <w:t xml:space="preserve">quadratic effect to one of the predictors to improve the assumptions for linear regression. </w:t>
+        <w:t xml:space="preserve">We initially ran a multiple linear regression model with multiple predictors but after looking at the residual plots, we thought it would be best to perform a log-linear transformation as well as add a quadratic effect to one of the predictors to improve the assumptions for linear regression. </w:t>
       </w:r>
     </w:p>
     <w:p>
@@ -465,37 +496,84 @@
       </w:r>
       <w:proofErr w:type="spellEnd"/>
       <w:r>
-        <w:t xml:space="preserve">, </w:t>
+        <w:t xml:space="preserve">, extra, </w:t>
       </w:r>
       <w:proofErr w:type="spellStart"/>
       <w:r>
-        <w:t>total_amount</w:t>
+        <w:t>trip_minutes</w:t>
       </w:r>
       <w:proofErr w:type="spellEnd"/>
       <w:r>
-        <w:t xml:space="preserve">, extra, </w:t>
+        <w:t xml:space="preserve">, and </w:t>
       </w:r>
       <w:proofErr w:type="spellStart"/>
       <w:r>
-        <w:t>trip_minutes</w:t>
+        <w:t>trip_distance</w:t>
       </w:r>
       <w:proofErr w:type="spellEnd"/>
       <w:r>
-        <w:t xml:space="preserve">, and </w:t>
+        <w:t xml:space="preserve">. After fitting multiple models and comparing how each of them satisfied the assumptions for linear regression, as well as their RMSE (Root Mean Squared Error) &amp; MAE (Mean Absolute Error), and then even furthering our filtering process of the data to remove any outliers that were justified of removal (observation 8455), we finally landed on a model. </w:t>
+      </w:r>
+    </w:p>
+    <w:p>
+      <w:pPr>
+        <w:pStyle w:val="ListParagraph"/>
+        <w:numPr>
+          <w:ilvl w:val="2"/>
+          <w:numId w:val="2"/>
+        </w:numPr>
+      </w:pPr>
+      <w:r>
+        <w:t>O</w:t>
+      </w:r>
+      <w:r>
+        <w:t>ur model was</w:t>
+      </w:r>
+      <w:r>
+        <w:t xml:space="preserve"> </w:t>
+      </w:r>
+      <w:r>
+        <w:t>log(</w:t>
       </w:r>
       <w:proofErr w:type="spellStart"/>
       <w:r>
-        <w:t>trip_distance</w:t>
+        <w:t>tip_</w:t>
+      </w:r>
+      <w:proofErr w:type="gramStart"/>
+      <w:r>
+        <w:t>amount</w:t>
       </w:r>
       <w:proofErr w:type="spellEnd"/>
       <w:r>
-        <w:t xml:space="preserve">. After fitting multiple models and comparing how each of them satisfied the assumptions for linear regression, as well as their RMSE (Root Mean Squared Error) &amp; MAE (Mean Absolute Error), and then even furthering our filtering process of the data to remove any </w:t>
-      </w:r>
-      <w:r>
-        <w:t>outliers</w:t>
-      </w:r>
-      <w:r>
-        <w:t xml:space="preserve"> that were justified of removal (observation 8455), we finally landed on a model. </w:t>
+        <w:t>)=</w:t>
+      </w:r>
+      <w:proofErr w:type="gramEnd"/>
+      <w:r>
+        <w:t>β0+β1(</w:t>
+      </w:r>
+      <w:proofErr w:type="spellStart"/>
+      <w:r>
+        <w:t>fare_</w:t>
+      </w:r>
+      <w:proofErr w:type="gramStart"/>
+      <w:r>
+        <w:t>amount</w:t>
+      </w:r>
+      <w:proofErr w:type="spellEnd"/>
+      <w:r>
+        <w:t>)+</w:t>
+      </w:r>
+      <w:proofErr w:type="gramEnd"/>
+      <w:r>
+        <w:t>β2(fare_amount^</w:t>
+      </w:r>
+      <w:proofErr w:type="gramStart"/>
+      <w:r>
+        <w:t>2)+</w:t>
+      </w:r>
+      <w:proofErr w:type="gramEnd"/>
+      <w:r>
+        <w:t>β3(extra)</w:t>
       </w:r>
     </w:p>
     <w:p>
@@ -507,37 +585,23 @@
         </w:numPr>
       </w:pPr>
       <w:r>
-        <w:t>Our model was</w:t>
-      </w:r>
-      <w:r>
-        <w:t xml:space="preserve">: </w:t>
-      </w:r>
-      <w:r>
-        <w:t>log(tip_</w:t>
-      </w:r>
-      <w:proofErr w:type="gramStart"/>
-      <w:r>
-        <w:t>amount)=</w:t>
-      </w:r>
-      <w:proofErr w:type="gramEnd"/>
-      <w:r>
-        <w:t>β0+β1(total_</w:t>
-      </w:r>
-      <w:proofErr w:type="gramStart"/>
-      <w:r>
-        <w:t>amount)+</w:t>
-      </w:r>
-      <w:proofErr w:type="gramEnd"/>
-      <w:r>
-        <w:t>β2(total_amount^</w:t>
-      </w:r>
-      <w:proofErr w:type="gramStart"/>
-      <w:r>
-        <w:t>2)+</w:t>
-      </w:r>
-      <w:proofErr w:type="gramEnd"/>
-      <w:r>
-        <w:t>β3(extra)+β4(trip_minutes)</w:t>
+        <w:t xml:space="preserve">We also explored adding an interaction between </w:t>
+      </w:r>
+      <w:proofErr w:type="spellStart"/>
+      <w:r>
+        <w:t>fare_amount</w:t>
+      </w:r>
+      <w:proofErr w:type="spellEnd"/>
+      <w:r>
+        <w:t xml:space="preserve"> and extra. While the p-value was significant when running the </w:t>
+      </w:r>
+      <w:proofErr w:type="spellStart"/>
+      <w:r>
+        <w:t>anova</w:t>
+      </w:r>
+      <w:proofErr w:type="spellEnd"/>
+      <w:r>
+        <w:t xml:space="preserve"> to compare our models, we only saw a very minimal drop in the Sum of Square Residuals, so we decided to leave the interaction out of our model.</w:t>
       </w:r>
     </w:p>
     <w:p>
@@ -549,7 +613,13 @@
         </w:numPr>
       </w:pPr>
       <w:r>
-        <w:t>The final log-linear model with a quadratic term for total amount provided the best overall fit among the models considered. Diagnostic plots suggested that linearity and constant variance were reasonably improved, although not perfectly satisfied. The Q-Q plot still showed noticeable tail departures from normality, indicating that the residuals were not fully normal. In addition, a small number of potentially influential observations remained. Despite these limitations, this model was retained because it was the most reasonable linear regression model we obtained and achieved the desired predictive performance.</w:t>
+        <w:t xml:space="preserve">The final log-linear model with a quadratic term for </w:t>
+      </w:r>
+      <w:r>
+        <w:t>fare</w:t>
+      </w:r>
+      <w:r>
+        <w:t xml:space="preserve"> amount provided the best overall fit among the models considered. Diagnostic plots suggested that linearity and constant variance were reasonably improved, although not perfectly satisfied. The Q-Q plot still showed noticeable tail departures from normality, indicating that the residuals were not fully normal. In addition, a small number of potentially influential observations remained. Despite these limitations, this model was retained because it was the most reasonable linear regression model we obtained and achieved the desired predictive performance.</w:t>
       </w:r>
     </w:p>
     <w:p>
@@ -561,7 +631,70 @@
         </w:numPr>
       </w:pPr>
       <w:r>
-        <w:t>Predicted values from the log-linear model were back-transformed to the original tip scale so that prediction error could be evaluated in dollars. Using these back-transformed predictions, the model achieved an RMSE of 1.089 and an MAE of 0.770, indicating that the model satisfied the project’s required prediction benchmarks (RMSE &lt;= 2, MAE &lt;= 1.5)</w:t>
+        <w:t>Predicted values from the log-linear model were back-transformed to the original tip scale so that prediction error could be evaluated in dollars. Using these back-transformed predictions, the model achieved an RMSE of 1.</w:t>
+      </w:r>
+      <w:r>
+        <w:t xml:space="preserve">244 </w:t>
+      </w:r>
+      <w:r>
+        <w:t>and an MAE of 0.</w:t>
+      </w:r>
+      <w:r>
+        <w:t>926,</w:t>
+      </w:r>
+      <w:r>
+        <w:t xml:space="preserve"> indicating that the model satisfied the project’s required prediction benchmarks (RMSE &lt;= 2, MAE &lt;= 1.5)</w:t>
+      </w:r>
+    </w:p>
+    <w:p>
+      <w:pPr>
+        <w:pStyle w:val="ListParagraph"/>
+        <w:numPr>
+          <w:ilvl w:val="0"/>
+          <w:numId w:val="2"/>
+        </w:numPr>
+        <w:rPr>
+          <w:b/>
+          <w:bCs/>
+        </w:rPr>
+      </w:pPr>
+      <w:r>
+        <w:rPr>
+          <w:b/>
+          <w:bCs/>
+        </w:rPr>
+        <w:t>Additional Thoughts</w:t>
+      </w:r>
+    </w:p>
+    <w:p>
+      <w:pPr>
+        <w:pStyle w:val="ListParagraph"/>
+        <w:numPr>
+          <w:ilvl w:val="1"/>
+          <w:numId w:val="2"/>
+        </w:numPr>
+      </w:pPr>
+      <w:r>
+        <w:lastRenderedPageBreak/>
+        <w:t>W</w:t>
+      </w:r>
+      <w:r>
+        <w:t xml:space="preserve">e also ran the same analysis for 100,000 observations (evenly distributed among the 12 months) to see if our findings would be similar and that proved to be the case. </w:t>
+      </w:r>
+    </w:p>
+    <w:p>
+      <w:pPr>
+        <w:pStyle w:val="ListParagraph"/>
+        <w:numPr>
+          <w:ilvl w:val="1"/>
+          <w:numId w:val="2"/>
+        </w:numPr>
+      </w:pPr>
+      <w:r>
+        <w:t>*</w:t>
+      </w:r>
+      <w:r>
+        <w:t>Include any additional justification as to why we are only predicting for when tip amounts are greater than 0.</w:t>
       </w:r>
     </w:p>
     <w:p/>

</xml_diff>

<commit_message>
added rag V2 for testing. Changes to app.R. Still issues
</commit_message>
<xml_diff>
--- a/RAG/Final Project RAG Document.docx
+++ b/RAG/Final Project RAG Document.docx
@@ -676,10 +676,7 @@
       </w:pPr>
       <w:r>
         <w:lastRenderedPageBreak/>
-        <w:t>W</w:t>
-      </w:r>
-      <w:r>
-        <w:t xml:space="preserve">e also ran the same analysis for 100,000 observations (evenly distributed among the 12 months) to see if our findings would be similar and that proved to be the case. </w:t>
+        <w:t xml:space="preserve">We also ran the same analysis for 100,000 observations (evenly distributed among the 12 months) to see if our findings would be similar and that proved to be the case. </w:t>
       </w:r>
     </w:p>
     <w:p>
@@ -691,10 +688,7 @@
         </w:numPr>
       </w:pPr>
       <w:r>
-        <w:t>*</w:t>
-      </w:r>
-      <w:r>
-        <w:t>Include any additional justification as to why we are only predicting for when tip amounts are greater than 0.</w:t>
+        <w:t>*Include any additional justification as to why we are only predicting for when tip amounts are greater than 0.</w:t>
       </w:r>
     </w:p>
     <w:p/>

</xml_diff>

<commit_message>
made serious changes to RAG in R shiny and its working well
</commit_message>
<xml_diff>
--- a/RAG/Final Project RAG Document.docx
+++ b/RAG/Final Project RAG Document.docx
@@ -9,6 +9,121 @@
       </w:pPr>
       <w:r>
         <w:t>Final Project RAG Document</w:t>
+      </w:r>
+    </w:p>
+    <w:p>
+      <w:pPr>
+        <w:ind w:left="720" w:hanging="360"/>
+        <w:rPr>
+          <w:b/>
+          <w:bCs/>
+        </w:rPr>
+      </w:pPr>
+      <w:r>
+        <w:rPr>
+          <w:b/>
+          <w:bCs/>
+        </w:rPr>
+        <w:t>Final Model Summary</w:t>
+      </w:r>
+    </w:p>
+    <w:p>
+      <w:pPr>
+        <w:ind w:left="720" w:hanging="360"/>
+      </w:pPr>
+      <w:r>
+        <w:t>Model type: log-linear regression with a quadratic term</w:t>
+      </w:r>
+    </w:p>
+    <w:p>
+      <w:pPr>
+        <w:ind w:left="720" w:hanging="360"/>
+      </w:pPr>
+      <w:r>
+        <w:t>Final model: log(</w:t>
+      </w:r>
+      <w:proofErr w:type="spellStart"/>
+      <w:r>
+        <w:t>tip_amount</w:t>
+      </w:r>
+      <w:proofErr w:type="spellEnd"/>
+      <w:r>
+        <w:t>) = beta0 + beta1*</w:t>
+      </w:r>
+      <w:proofErr w:type="spellStart"/>
+      <w:r>
+        <w:t>fare_amount</w:t>
+      </w:r>
+      <w:proofErr w:type="spellEnd"/>
+      <w:r>
+        <w:t xml:space="preserve"> + beta2*fare_amount^2 + beta3*extra</w:t>
+      </w:r>
+    </w:p>
+    <w:p>
+      <w:pPr>
+        <w:ind w:left="720" w:hanging="360"/>
+      </w:pPr>
+      <w:r>
+        <w:t xml:space="preserve">Interaction tested: </w:t>
+      </w:r>
+      <w:proofErr w:type="spellStart"/>
+      <w:r>
+        <w:t>fare_amount</w:t>
+      </w:r>
+      <w:proofErr w:type="spellEnd"/>
+      <w:r>
+        <w:t xml:space="preserve"> × extra, not retained</w:t>
+      </w:r>
+    </w:p>
+    <w:p>
+      <w:pPr>
+        <w:ind w:left="720" w:hanging="360"/>
+      </w:pPr>
+      <w:r>
+        <w:t>Performance: RMSE = 1.244, MAE = 0.92</w:t>
+      </w:r>
+      <w:r>
+        <w:t>5</w:t>
+      </w:r>
+    </w:p>
+    <w:p>
+      <w:pPr>
+        <w:ind w:left="720" w:hanging="360"/>
+      </w:pPr>
+      <w:r>
+        <w:t xml:space="preserve">Filtering before modeling: credit card only, </w:t>
+      </w:r>
+      <w:proofErr w:type="spellStart"/>
+      <w:r>
+        <w:t>passenger_count</w:t>
+      </w:r>
+      <w:proofErr w:type="spellEnd"/>
+      <w:r>
+        <w:t xml:space="preserve"> = 1, non-airport trips, </w:t>
+      </w:r>
+      <w:proofErr w:type="spellStart"/>
+      <w:r>
+        <w:t>tip_amount</w:t>
+      </w:r>
+      <w:proofErr w:type="spellEnd"/>
+      <w:r>
+        <w:t xml:space="preserve"> &gt; 0, </w:t>
+      </w:r>
+      <w:proofErr w:type="spellStart"/>
+      <w:r>
+        <w:t>trip_distance</w:t>
+      </w:r>
+      <w:proofErr w:type="spellEnd"/>
+      <w:r>
+        <w:t xml:space="preserve"> &gt; 0, </w:t>
+      </w:r>
+      <w:proofErr w:type="spellStart"/>
+      <w:r>
+        <w:t>trip_minutes</w:t>
+      </w:r>
+      <w:proofErr w:type="spellEnd"/>
+      <w:r>
+        <w:t xml:space="preserve"> &gt; 0</w:t>
       </w:r>
     </w:p>
     <w:p>
@@ -243,6 +358,7 @@
         </w:numPr>
       </w:pPr>
       <w:r>
+        <w:lastRenderedPageBreak/>
         <w:t>The distribution of tip percentage is heavily right-skewed, with most rides having tip percentages in a moderate range and a small number of rides exhibiting unusually large tip percentages. This long right tail suggests the presence of outliers and indicates that tip percentage is not normally distributed.</w:t>
       </w:r>
     </w:p>
@@ -267,11 +383,7 @@
         </w:numPr>
       </w:pPr>
       <w:r>
-        <w:t xml:space="preserve">There appears to be a negative, nonlinear association between fare amount and tip percentage. For smaller fares, tip percentages are much more spread out and can be quite large, while for larger fares, tip percentages tend to be lower and more tightly clustered. This pattern suggests that riders often leave </w:t>
-      </w:r>
-      <w:r>
-        <w:lastRenderedPageBreak/>
-        <w:t xml:space="preserve">disproportionately high percentage tips on very small fares, whereas tip percentages become more consistent at more moderate levels as </w:t>
+        <w:t xml:space="preserve">There appears to be a negative, nonlinear association between fare amount and tip percentage. For smaller fares, tip percentages are much more spread out and can be quite large, while for larger fares, tip percentages tend to be lower and more tightly clustered. This pattern suggests that riders often leave disproportionately high percentage tips on very small fares, whereas tip percentages become more consistent at more moderate levels as </w:t>
       </w:r>
       <w:proofErr w:type="spellStart"/>
       <w:r>
@@ -431,6 +543,7 @@
         </w:numPr>
       </w:pPr>
       <w:r>
+        <w:lastRenderedPageBreak/>
         <w:t xml:space="preserve">Right before we began modeling, we decided to filter our dataset a little more. We wanted to only focus on rides where the </w:t>
       </w:r>
       <w:proofErr w:type="spellStart"/>
@@ -475,8 +588,154 @@
         </w:numPr>
       </w:pPr>
       <w:r>
+        <w:t xml:space="preserve">We initially ran a multiple linear regression model with multiple predictors but after looking at the residual plots, we thought it would be best to perform a log-linear transformation as well as add a quadratic effect to one of the predictors to improve the assumptions for linear regression. </w:t>
+      </w:r>
+    </w:p>
+    <w:p>
+      <w:pPr>
+        <w:pStyle w:val="ListParagraph"/>
+        <w:numPr>
+          <w:ilvl w:val="2"/>
+          <w:numId w:val="2"/>
+        </w:numPr>
+      </w:pPr>
+      <w:r>
+        <w:t xml:space="preserve">We experimented with predictors such as </w:t>
+      </w:r>
+      <w:proofErr w:type="spellStart"/>
+      <w:r>
+        <w:t>fare_amount</w:t>
+      </w:r>
+      <w:proofErr w:type="spellEnd"/>
+      <w:r>
+        <w:t xml:space="preserve">, extra, </w:t>
+      </w:r>
+      <w:proofErr w:type="spellStart"/>
+      <w:r>
+        <w:t>trip_minutes</w:t>
+      </w:r>
+      <w:proofErr w:type="spellEnd"/>
+      <w:r>
+        <w:t xml:space="preserve">, and </w:t>
+      </w:r>
+      <w:proofErr w:type="spellStart"/>
+      <w:r>
+        <w:t>trip_distance</w:t>
+      </w:r>
+      <w:proofErr w:type="spellEnd"/>
+      <w:r>
+        <w:t xml:space="preserve">. After fitting multiple models and comparing how each of them satisfied the assumptions for linear regression, as well as their RMSE (Root Mean Squared Error) &amp; MAE (Mean Absolute Error), and then even furthering our filtering process of the data to remove any outliers that were justified of removal, we finally landed on a model. </w:t>
+      </w:r>
+    </w:p>
+    <w:p>
+      <w:pPr>
+        <w:pStyle w:val="ListParagraph"/>
+        <w:numPr>
+          <w:ilvl w:val="2"/>
+          <w:numId w:val="2"/>
+        </w:numPr>
+      </w:pPr>
+      <w:r>
+        <w:t>O</w:t>
+      </w:r>
+      <w:r>
+        <w:t>ur model was</w:t>
+      </w:r>
+      <w:r>
+        <w:t xml:space="preserve"> </w:t>
+      </w:r>
+      <w:r>
+        <w:t>log(</w:t>
+      </w:r>
+      <w:proofErr w:type="spellStart"/>
+      <w:r>
+        <w:t>tip_</w:t>
+      </w:r>
+      <w:proofErr w:type="gramStart"/>
+      <w:r>
+        <w:t>amount</w:t>
+      </w:r>
+      <w:proofErr w:type="spellEnd"/>
+      <w:r>
+        <w:t>)=</w:t>
+      </w:r>
+      <w:proofErr w:type="gramEnd"/>
+      <w:r>
+        <w:t>β0+β1(</w:t>
+      </w:r>
+      <w:proofErr w:type="spellStart"/>
+      <w:r>
+        <w:t>fare_</w:t>
+      </w:r>
+      <w:proofErr w:type="gramStart"/>
+      <w:r>
+        <w:t>amount</w:t>
+      </w:r>
+      <w:proofErr w:type="spellEnd"/>
+      <w:r>
+        <w:t>)+</w:t>
+      </w:r>
+      <w:proofErr w:type="gramEnd"/>
+      <w:r>
+        <w:t>β2(fare_amount^</w:t>
+      </w:r>
+      <w:proofErr w:type="gramStart"/>
+      <w:r>
+        <w:t>2)+</w:t>
+      </w:r>
+      <w:proofErr w:type="gramEnd"/>
+      <w:r>
+        <w:t>β3(extra)</w:t>
+      </w:r>
+    </w:p>
+    <w:p>
+      <w:pPr>
+        <w:pStyle w:val="ListParagraph"/>
+        <w:numPr>
+          <w:ilvl w:val="2"/>
+          <w:numId w:val="2"/>
+        </w:numPr>
+      </w:pPr>
+      <w:r>
+        <w:t xml:space="preserve">We also explored adding an interaction between </w:t>
+      </w:r>
+      <w:proofErr w:type="spellStart"/>
+      <w:r>
+        <w:t>fare_amount</w:t>
+      </w:r>
+      <w:proofErr w:type="spellEnd"/>
+      <w:r>
+        <w:t xml:space="preserve"> and extra. While the p-value was significant when running the </w:t>
+      </w:r>
+      <w:proofErr w:type="spellStart"/>
+      <w:r>
+        <w:t>anova</w:t>
+      </w:r>
+      <w:proofErr w:type="spellEnd"/>
+      <w:r>
+        <w:t xml:space="preserve"> to compare our models, we only saw a very minimal drop in the Sum of Square Residuals, so we decided to leave the interaction out of our model.</w:t>
+      </w:r>
+    </w:p>
+    <w:p>
+      <w:pPr>
+        <w:pStyle w:val="ListParagraph"/>
+        <w:numPr>
+          <w:ilvl w:val="2"/>
+          <w:numId w:val="2"/>
+        </w:numPr>
+      </w:pPr>
+      <w:r>
+        <w:t xml:space="preserve">The final log-linear model with a quadratic term for </w:t>
+      </w:r>
+      <w:r>
+        <w:t>fare</w:t>
+      </w:r>
+      <w:r>
+        <w:t xml:space="preserve"> amount provided the best overall fit among the models considered. Diagnostic plots suggested that linearity and constant variance were reasonably improved, although not perfectly satisfied. The Q-Q plot still showed noticeable tail departures from normality, indicating that the residuals were not fully normal. In addition, a small number of potentially influential observations remained. Despite these limitations, this model was retained because it was the most reasonable linear </w:t>
+      </w:r>
+      <w:r>
         <w:lastRenderedPageBreak/>
-        <w:t xml:space="preserve">We initially ran a multiple linear regression model with multiple predictors but after looking at the residual plots, we thought it would be best to perform a log-linear transformation as well as add a quadratic effect to one of the predictors to improve the assumptions for linear regression. </w:t>
+        <w:t>regression model we obtained and achieved the desired predictive performance.</w:t>
       </w:r>
     </w:p>
     <w:p>
@@ -488,149 +747,6 @@
         </w:numPr>
       </w:pPr>
       <w:r>
-        <w:t xml:space="preserve">We experimented with predictors such as </w:t>
-      </w:r>
-      <w:proofErr w:type="spellStart"/>
-      <w:r>
-        <w:t>fare_amount</w:t>
-      </w:r>
-      <w:proofErr w:type="spellEnd"/>
-      <w:r>
-        <w:t xml:space="preserve">, extra, </w:t>
-      </w:r>
-      <w:proofErr w:type="spellStart"/>
-      <w:r>
-        <w:t>trip_minutes</w:t>
-      </w:r>
-      <w:proofErr w:type="spellEnd"/>
-      <w:r>
-        <w:t xml:space="preserve">, and </w:t>
-      </w:r>
-      <w:proofErr w:type="spellStart"/>
-      <w:r>
-        <w:t>trip_distance</w:t>
-      </w:r>
-      <w:proofErr w:type="spellEnd"/>
-      <w:r>
-        <w:t xml:space="preserve">. After fitting multiple models and comparing how each of them satisfied the assumptions for linear regression, as well as their RMSE (Root Mean Squared Error) &amp; MAE (Mean Absolute Error), and then even furthering our filtering process of the data to remove any outliers that were justified of removal (observation 8455), we finally landed on a model. </w:t>
-      </w:r>
-    </w:p>
-    <w:p>
-      <w:pPr>
-        <w:pStyle w:val="ListParagraph"/>
-        <w:numPr>
-          <w:ilvl w:val="2"/>
-          <w:numId w:val="2"/>
-        </w:numPr>
-      </w:pPr>
-      <w:r>
-        <w:t>O</w:t>
-      </w:r>
-      <w:r>
-        <w:t>ur model was</w:t>
-      </w:r>
-      <w:r>
-        <w:t xml:space="preserve"> </w:t>
-      </w:r>
-      <w:r>
-        <w:t>log(</w:t>
-      </w:r>
-      <w:proofErr w:type="spellStart"/>
-      <w:r>
-        <w:t>tip_</w:t>
-      </w:r>
-      <w:proofErr w:type="gramStart"/>
-      <w:r>
-        <w:t>amount</w:t>
-      </w:r>
-      <w:proofErr w:type="spellEnd"/>
-      <w:r>
-        <w:t>)=</w:t>
-      </w:r>
-      <w:proofErr w:type="gramEnd"/>
-      <w:r>
-        <w:t>β0+β1(</w:t>
-      </w:r>
-      <w:proofErr w:type="spellStart"/>
-      <w:r>
-        <w:t>fare_</w:t>
-      </w:r>
-      <w:proofErr w:type="gramStart"/>
-      <w:r>
-        <w:t>amount</w:t>
-      </w:r>
-      <w:proofErr w:type="spellEnd"/>
-      <w:r>
-        <w:t>)+</w:t>
-      </w:r>
-      <w:proofErr w:type="gramEnd"/>
-      <w:r>
-        <w:t>β2(fare_amount^</w:t>
-      </w:r>
-      <w:proofErr w:type="gramStart"/>
-      <w:r>
-        <w:t>2)+</w:t>
-      </w:r>
-      <w:proofErr w:type="gramEnd"/>
-      <w:r>
-        <w:t>β3(extra)</w:t>
-      </w:r>
-    </w:p>
-    <w:p>
-      <w:pPr>
-        <w:pStyle w:val="ListParagraph"/>
-        <w:numPr>
-          <w:ilvl w:val="2"/>
-          <w:numId w:val="2"/>
-        </w:numPr>
-      </w:pPr>
-      <w:r>
-        <w:t xml:space="preserve">We also explored adding an interaction between </w:t>
-      </w:r>
-      <w:proofErr w:type="spellStart"/>
-      <w:r>
-        <w:t>fare_amount</w:t>
-      </w:r>
-      <w:proofErr w:type="spellEnd"/>
-      <w:r>
-        <w:t xml:space="preserve"> and extra. While the p-value was significant when running the </w:t>
-      </w:r>
-      <w:proofErr w:type="spellStart"/>
-      <w:r>
-        <w:t>anova</w:t>
-      </w:r>
-      <w:proofErr w:type="spellEnd"/>
-      <w:r>
-        <w:t xml:space="preserve"> to compare our models, we only saw a very minimal drop in the Sum of Square Residuals, so we decided to leave the interaction out of our model.</w:t>
-      </w:r>
-    </w:p>
-    <w:p>
-      <w:pPr>
-        <w:pStyle w:val="ListParagraph"/>
-        <w:numPr>
-          <w:ilvl w:val="2"/>
-          <w:numId w:val="2"/>
-        </w:numPr>
-      </w:pPr>
-      <w:r>
-        <w:t xml:space="preserve">The final log-linear model with a quadratic term for </w:t>
-      </w:r>
-      <w:r>
-        <w:t>fare</w:t>
-      </w:r>
-      <w:r>
-        <w:t xml:space="preserve"> amount provided the best overall fit among the models considered. Diagnostic plots suggested that linearity and constant variance were reasonably improved, although not perfectly satisfied. The Q-Q plot still showed noticeable tail departures from normality, indicating that the residuals were not fully normal. In addition, a small number of potentially influential observations remained. Despite these limitations, this model was retained because it was the most reasonable linear regression model we obtained and achieved the desired predictive performance.</w:t>
-      </w:r>
-    </w:p>
-    <w:p>
-      <w:pPr>
-        <w:pStyle w:val="ListParagraph"/>
-        <w:numPr>
-          <w:ilvl w:val="2"/>
-          <w:numId w:val="2"/>
-        </w:numPr>
-      </w:pPr>
-      <w:r>
         <w:t>Predicted values from the log-linear model were back-transformed to the original tip scale so that prediction error could be evaluated in dollars. Using these back-transformed predictions, the model achieved an RMSE of 1.</w:t>
       </w:r>
       <w:r>
@@ -640,7 +756,13 @@
         <w:t>and an MAE of 0.</w:t>
       </w:r>
       <w:r>
-        <w:t>926,</w:t>
+        <w:t>92</w:t>
+      </w:r>
+      <w:r>
+        <w:t>5</w:t>
+      </w:r>
+      <w:r>
+        <w:t>,</w:t>
       </w:r>
       <w:r>
         <w:t xml:space="preserve"> indicating that the model satisfied the project’s required prediction benchmarks (RMSE &lt;= 2, MAE &lt;= 1.5)</w:t>
@@ -675,7 +797,6 @@
         </w:numPr>
       </w:pPr>
       <w:r>
-        <w:lastRenderedPageBreak/>
         <w:t xml:space="preserve">We also ran the same analysis for 100,000 observations (evenly distributed among the 12 months) to see if our findings would be similar and that proved to be the case. </w:t>
       </w:r>
     </w:p>

</xml_diff>